<commit_message>
Refresh the reconnect banner live, guide ad account creation, show reports in INR
The header banner loaded social accounts once per app load, so it kept saying "needs reconnecting" after a successful reconnect. The launcher's no-ad-account notice now lists how to create one, Social Reports no longer hard-codes "$", and the Meta setup guide documents the permissions to add inside each use case.

Co-Authored-By: Claude Opus 5.5 <noreply@anthropic.com>
</commit_message>
<xml_diff>
--- a/docs/WapHub-Social-Media-Connection-Guide.docx
+++ b/docs/WapHub-Social-Media-Connection-Guide.docx
@@ -1040,6 +1040,278 @@
       </w:r>
       <w:r>
         <w:t>— Social Inbox (Messenger).</w:t>
+      </w:r>
+    </w:p>
+    <w:p>
+      <w:pPr>
+        <w:pStyle w:val="Heading2"/>
+      </w:pPr>
+      <w:r>
+        <w:t xml:space="preserve">2.3.1 Add the permissions inside each use case</w:t>
+      </w:r>
+    </w:p>
+    <w:p>
+      <w:r>
+        <w:t xml:space="preserve">Adding a use case is not enough. Open each use case → Customize → Permissions and features, and click “+ Add” on every permission below until its status shows “Ready for testing”. A permission that is not added makes Meta reject the login with “Invalid Scopes”, or refuse that one feature later.</w:t>
+      </w:r>
+    </w:p>
+    <w:tbl>
+      <w:tblPr>
+        <w:tblStyle w:val="TableGrid"/>
+        <w:tblW w:type="auto" w:w="0"/>
+        <w:tblLook w:firstColumn="1" w:firstRow="1" w:lastColumn="0" w:lastRow="0" w:noHBand="0" w:noVBand="1" w:val="04A0"/>
+      </w:tblPr>
+      <w:tblGrid>
+        <w:gridCol w:w="3168"/>
+        <w:gridCol w:w="3744"/>
+        <w:gridCol w:w="2304"/>
+      </w:tblGrid>
+      <w:tr>
+        <w:tc>
+          <w:tcPr>
+            <w:tcW w:type="dxa" w:w="3168"/>
+            <w:shd w:val="clear" w:color="auto" w:fill="047857"/>
+          </w:tcPr>
+          <w:p>
+            <w:r>
+              <w:rPr>
+                <w:b/>
+                <w:color w:val="FFFFFF"/>
+              </w:rPr>
+              <w:t xml:space="preserve">Use case → Customize</w:t>
+            </w:r>
+          </w:p>
+        </w:tc>
+        <w:tc>
+          <w:tcPr>
+            <w:tcW w:type="dxa" w:w="3744"/>
+            <w:shd w:val="clear" w:color="auto" w:fill="047857"/>
+          </w:tcPr>
+          <w:p>
+            <w:r>
+              <w:rPr>
+                <w:b/>
+                <w:color w:val="FFFFFF"/>
+              </w:rPr>
+              <w:t xml:space="preserve">Click “+ Add” on each</w:t>
+            </w:r>
+          </w:p>
+        </w:tc>
+        <w:tc>
+          <w:tcPr>
+            <w:tcW w:type="dxa" w:w="2304"/>
+            <w:shd w:val="clear" w:color="auto" w:fill="047857"/>
+          </w:tcPr>
+          <w:p>
+            <w:r>
+              <w:rPr>
+                <w:b/>
+                <w:color w:val="FFFFFF"/>
+              </w:rPr>
+              <w:t xml:space="preserve">Used by WapHub for</w:t>
+            </w:r>
+          </w:p>
+        </w:tc>
+      </w:tr>
+      <w:tr>
+        <w:tc>
+          <w:tcPr>
+            <w:tcW w:type="dxa" w:w="3168"/>
+          </w:tcPr>
+          <w:p>
+            <w:r>
+              <w:t xml:space="preserve">Manage everything on your Page</w:t>
+            </w:r>
+          </w:p>
+        </w:tc>
+        <w:tc>
+          <w:tcPr>
+            <w:tcW w:type="dxa" w:w="3744"/>
+          </w:tcPr>
+          <w:p>
+            <w:r>
+              <w:t xml:space="preserve">pages_show_list, pages_read_engagement, business_management, pages_manage_posts, pages_manage_metadata</w:t>
+            </w:r>
+          </w:p>
+        </w:tc>
+        <w:tc>
+          <w:tcPr>
+            <w:tcW w:type="dxa" w:w="2304"/>
+          </w:tcPr>
+          <w:p>
+            <w:r>
+              <w:t xml:space="preserve">Connect Page, Page posts, Lead Ads webhook</w:t>
+            </w:r>
+          </w:p>
+        </w:tc>
+      </w:tr>
+      <w:tr>
+        <w:tc>
+          <w:tcPr>
+            <w:tcW w:type="dxa" w:w="3168"/>
+          </w:tcPr>
+          <w:p>
+            <w:r>
+              <w:t xml:space="preserve">Manage messaging &amp; content on Instagram (API setup with Facebook login)</w:t>
+            </w:r>
+          </w:p>
+        </w:tc>
+        <w:tc>
+          <w:tcPr>
+            <w:tcW w:type="dxa" w:w="3744"/>
+          </w:tcPr>
+          <w:p>
+            <w:r>
+              <w:t xml:space="preserve">instagram_basic, instagram_content_publish, instagram_manage_messages</w:t>
+            </w:r>
+          </w:p>
+        </w:tc>
+        <w:tc>
+          <w:tcPr>
+            <w:tcW w:type="dxa" w:w="2304"/>
+          </w:tcPr>
+          <w:p>
+            <w:r>
+              <w:t xml:space="preserve">Instagram account, posts &amp; reels, Instagram DMs</w:t>
+            </w:r>
+          </w:p>
+        </w:tc>
+      </w:tr>
+      <w:tr>
+        <w:tc>
+          <w:tcPr>
+            <w:tcW w:type="dxa" w:w="3168"/>
+          </w:tcPr>
+          <w:p>
+            <w:r>
+              <w:t xml:space="preserve">Create &amp; manage ads with Marketing API</w:t>
+            </w:r>
+          </w:p>
+        </w:tc>
+        <w:tc>
+          <w:tcPr>
+            <w:tcW w:type="dxa" w:w="3744"/>
+          </w:tcPr>
+          <w:p>
+            <w:r>
+              <w:t xml:space="preserve">ads_read, ads_management, business_management</w:t>
+            </w:r>
+          </w:p>
+        </w:tc>
+        <w:tc>
+          <w:tcPr>
+            <w:tcW w:type="dxa" w:w="2304"/>
+          </w:tcPr>
+          <w:p>
+            <w:r>
+              <w:t xml:space="preserve">Meta Ads Launcher, Ads Dashboard</w:t>
+            </w:r>
+          </w:p>
+        </w:tc>
+      </w:tr>
+      <w:tr>
+        <w:tc>
+          <w:tcPr>
+            <w:tcW w:type="dxa" w:w="3168"/>
+          </w:tcPr>
+          <w:p>
+            <w:r>
+              <w:t xml:space="preserve">Capture &amp; manage ad leads with Marketing API</w:t>
+            </w:r>
+          </w:p>
+        </w:tc>
+        <w:tc>
+          <w:tcPr>
+            <w:tcW w:type="dxa" w:w="3744"/>
+          </w:tcPr>
+          <w:p>
+            <w:r>
+              <w:t xml:space="preserve">leads_retrieval, pages_manage_metadata</w:t>
+            </w:r>
+          </w:p>
+        </w:tc>
+        <w:tc>
+          <w:tcPr>
+            <w:tcW w:type="dxa" w:w="2304"/>
+          </w:tcPr>
+          <w:p>
+            <w:r>
+              <w:t xml:space="preserve">Lead Ads → Instant Lead CRM</w:t>
+            </w:r>
+          </w:p>
+        </w:tc>
+      </w:tr>
+      <w:tr>
+        <w:tc>
+          <w:tcPr>
+            <w:tcW w:type="dxa" w:w="3168"/>
+          </w:tcPr>
+          <w:p>
+            <w:r>
+              <w:t xml:space="preserve">Engage with customers on Messenger from Meta</w:t>
+            </w:r>
+          </w:p>
+        </w:tc>
+        <w:tc>
+          <w:tcPr>
+            <w:tcW w:type="dxa" w:w="3744"/>
+          </w:tcPr>
+          <w:p>
+            <w:r>
+              <w:t xml:space="preserve">pages_messaging</w:t>
+            </w:r>
+          </w:p>
+        </w:tc>
+        <w:tc>
+          <w:tcPr>
+            <w:tcW w:type="dxa" w:w="2304"/>
+          </w:tcPr>
+          <w:p>
+            <w:r>
+              <w:t xml:space="preserve">Social Inbox (Messenger)</w:t>
+            </w:r>
+          </w:p>
+        </w:tc>
+      </w:tr>
+    </w:tbl>
+    <w:p>
+      <w:pPr>
+        <w:pStyle w:val="ListBullet"/>
+      </w:pPr>
+      <w:r>
+        <w:t xml:space="preserve">Instagram: open the “API setup with Facebook login” permissions (instagram_basic …). Do not add instagram_business_* permissions — those belong to Instagram login, which WapHub does not use.</w:t>
+      </w:r>
+    </w:p>
+    <w:p>
+      <w:pPr>
+        <w:pStyle w:val="ListBullet"/>
+      </w:pPr>
+      <w:r>
+        <w:t xml:space="preserve">The Add use cases dialog opens on “Featured (2)”. Switch the filter to “Business messaging” to find the Messenger use case and to “Ads and monetization” to find “Capture &amp; manage ad leads with Marketing API”.</w:t>
+      </w:r>
+    </w:p>
+    <w:p>
+      <w:pPr>
+        <w:pStyle w:val="ListBullet"/>
+      </w:pPr>
+      <w:r>
+        <w:t xml:space="preserve">leads_retrieval exists only in the ad leads use case, and pages_messaging only in the Messenger use case.</w:t>
+      </w:r>
+    </w:p>
+    <w:p>
+      <w:pPr>
+        <w:pStyle w:val="ListBullet"/>
+      </w:pPr>
+      <w:r>
+        <w:t xml:space="preserve">Optional extras (pages_manage_engagement, pages_read_user_content, read_insights, pages_manage_ads, instagram_manage_comments, instagram_manage_insights) are harmless to add, but WapHub does not request them today.</w:t>
+      </w:r>
+    </w:p>
+    <w:p>
+      <w:pPr>
+        <w:pStyle w:val="ListBullet"/>
+      </w:pPr>
+      <w:r>
+        <w:t xml:space="preserve">After adding permissions: tick the matching groups in Social Gateway Settings (Part 3), then every client reconnects once so the new permissions are granted.</w:t>
       </w:r>
     </w:p>
     <w:p>
@@ -2682,7 +2954,39 @@
           </w:tcPr>
           <w:p>
             <w:r>
-              <w:t>Add the use case (2.3) or untick that group in Social Gateway Settings.</w:t>
+              <w:t>Add the use case (2.3) and “+ Add” each permission inside it (2.3.1), or untick that group in Social Gateway Settings.</w:t>
+            </w:r>
+          </w:p>
+        </w:tc>
+      </w:tr>
+      <w:tr>
+        <w:tc>
+          <w:tcPr>
+            <w:tcW w:type="dxa" w:w="2736"/>
+          </w:tcPr>
+          <w:p>
+            <w:r>
+              <w:t xml:space="preserve">Page connects, but Social Inbox / Organic Post / Meta Ads then show “Access revoked”</w:t>
+            </w:r>
+          </w:p>
+        </w:tc>
+        <w:tc>
+          <w:tcPr>
+            <w:tcW w:type="dxa" w:w="3168"/>
+          </w:tcPr>
+          <w:p>
+            <w:r>
+              <w:t xml:space="preserve">Meta refused that feature because its permission is not added on the app or not granted (Graph error 10 / 200). WapHub versions before 2026-10-15 then marked the whole Page revoked.</w:t>
+            </w:r>
+          </w:p>
+        </w:tc>
+        <w:tc>
+          <w:tcPr>
+            <w:tcW w:type="dxa" w:w="3312"/>
+          </w:tcPr>
+          <w:p>
+            <w:r>
+              <w:t xml:space="preserve">Add the permission (2.3.1), tick its group (Part 3), reconnect and press Check. From 2026-10-15 WapHub shows “Permission missing” and keeps the Page connected.</w:t>
             </w:r>
           </w:p>
         </w:tc>
@@ -2934,6 +3238,11 @@
     <w:p>
       <w:r>
         <w:t>☐  Use cases added (2.3)</w:t>
+      </w:r>
+    </w:p>
+    <w:p>
+      <w:r>
+        <w:t xml:space="preserve">☐  Every permission inside each use case shows “Ready for testing” (2.3.1)</w:t>
       </w:r>
     </w:p>
     <w:p>

</xml_diff>

<commit_message>
Ads review fixes, how-to-pay steps, and INR in the PDF report
A finished campaign whose end date was moved later started spending on Meta while WapHub showed it paused and the budget guard ignored it; it now stays paused on Meta until Resume. Also: final insights before a campaign is marked finished, no revived OAuth grant when an ad account is created during a concurrent connect, IST in the ended message, and no stale "Run again" form. Clients get step-by-step instructions for adding money to their Meta ad account, and the monthly PDF report no longer prints "$".

Co-Authored-By: Claude Opus 5.5 <noreply@anthropic.com>
</commit_message>
<xml_diff>
--- a/docs/WapHub-Social-Media-Connection-Guide.docx
+++ b/docs/WapHub-Social-Media-Connection-Guide.docx
@@ -2383,7 +2383,168 @@
         <w:pStyle w:val="Heading2"/>
       </w:pPr>
       <w:r>
-        <w:t>4.3 Reconnect when</w:t>
+        <w:t xml:space="preserve">4.3 No ad account yet? Create one in WapHub</w:t>
+      </w:r>
+    </w:p>
+    <w:p>
+      <w:pPr>
+        <w:pStyle w:val="ListBullet"/>
+      </w:pPr>
+      <w:r>
+        <w:rPr>
+          <w:b/>
+        </w:rPr>
+        <w:t xml:space="preserve">1. </w:t>
+      </w:r>
+      <w:r>
+        <w:t xml:space="preserve">In the window that lists what Facebook shared (4.2), the form “Create a Meta ad account” opens by itself when no ad account was found (or click “Create a new ad account”).</w:t>
+      </w:r>
+    </w:p>
+    <w:p>
+      <w:pPr>
+        <w:pStyle w:val="ListBullet"/>
+      </w:pPr>
+      <w:r>
+        <w:rPr>
+          <w:b/>
+        </w:rPr>
+        <w:t xml:space="preserve">2. </w:t>
+      </w:r>
+      <w:r>
+        <w:t xml:space="preserve">Choose your Business portfolio and keep or change the name, then click Create ad account. WapHub creates it in Indian Rupees (INR) on India time — no need to open Meta.</w:t>
+      </w:r>
+    </w:p>
+    <w:p>
+      <w:pPr>
+        <w:pStyle w:val="ListBullet"/>
+      </w:pPr>
+      <w:r>
+        <w:rPr>
+          <w:b/>
+        </w:rPr>
+        <w:t xml:space="preserve">3. </w:t>
+      </w:r>
+      <w:r>
+        <w:t xml:space="preserve">The new ad account is ticked together with your Page — click Connect.</w:t>
+      </w:r>
+    </w:p>
+    <w:p>
+      <w:pPr>
+        <w:pStyle w:val="ListBullet"/>
+      </w:pPr>
+      <w:r>
+        <w:rPr>
+          <w:b/>
+        </w:rPr>
+        <w:t xml:space="preserve">Note: </w:t>
+      </w:r>
+      <w:r>
+        <w:t xml:space="preserve">No Business portfolio? Create one free at business.facebook.com, then connect again. Meta limits how many ad accounts one portfolio may create.</w:t>
+      </w:r>
+    </w:p>
+    <w:p>
+      <w:pPr>
+        <w:pStyle w:val="Heading2"/>
+      </w:pPr>
+      <w:r>
+        <w:t xml:space="preserve">4.4 Add money to your ad account (payment)</w:t>
+      </w:r>
+    </w:p>
+    <w:p>
+      <w:r>
+        <w:t xml:space="preserve">Meta does not let any app add a card or money, so this one step is done on Meta. WapHub shows the same steps under “How to add money to your Meta ad account” (after creating an ad account, in the Ads Launcher and when ads stop for payment).</w:t>
+      </w:r>
+    </w:p>
+    <w:p>
+      <w:pPr>
+        <w:pStyle w:val="ListBullet"/>
+      </w:pPr>
+      <w:r>
+        <w:rPr>
+          <w:b/>
+        </w:rPr>
+        <w:t xml:space="preserve">1. </w:t>
+      </w:r>
+      <w:r>
+        <w:t xml:space="preserve">Open Meta billing (business.facebook.com → Billing &amp; payments) and log in with the same Facebook account you connected to WapHub.</w:t>
+      </w:r>
+    </w:p>
+    <w:p>
+      <w:pPr>
+        <w:pStyle w:val="ListBullet"/>
+      </w:pPr>
+      <w:r>
+        <w:rPr>
+          <w:b/>
+        </w:rPr>
+        <w:t xml:space="preserve">2. </w:t>
+      </w:r>
+      <w:r>
+        <w:t xml:space="preserve">At the top left, choose the ad account WapHub uses (the name shown in WapHub, e.g. “Shana Trends Ads”).</w:t>
+      </w:r>
+    </w:p>
+    <w:p>
+      <w:pPr>
+        <w:pStyle w:val="ListBullet"/>
+      </w:pPr>
+      <w:r>
+        <w:rPr>
+          <w:b/>
+        </w:rPr>
+        <w:t xml:space="preserve">3. </w:t>
+      </w:r>
+      <w:r>
+        <w:t xml:space="preserve">Payment settings → Add payment method. In India: UPI, debit / credit card (RuPay, Visa, Mastercard) or net banking.</w:t>
+      </w:r>
+    </w:p>
+    <w:p>
+      <w:pPr>
+        <w:pStyle w:val="ListBullet"/>
+      </w:pPr>
+      <w:r>
+        <w:rPr>
+          <w:b/>
+        </w:rPr>
+        <w:t xml:space="preserve">4. </w:t>
+      </w:r>
+      <w:r>
+        <w:t xml:space="preserve">Prepaid accounts: click “Add funds”, enter the amount in ₹ (e.g. ₹1,000) and pay by UPI or card. It shows as available funds within a few minutes.</w:t>
+      </w:r>
+    </w:p>
+    <w:p>
+      <w:pPr>
+        <w:pStyle w:val="ListBullet"/>
+      </w:pPr>
+      <w:r>
+        <w:rPr>
+          <w:b/>
+        </w:rPr>
+        <w:t xml:space="preserve">5. </w:t>
+      </w:r>
+      <w:r>
+        <w:t xml:space="preserve">If Meta asks, fill your business name and address (GSTIN optional).</w:t>
+      </w:r>
+    </w:p>
+    <w:p>
+      <w:pPr>
+        <w:pStyle w:val="ListBullet"/>
+      </w:pPr>
+      <w:r>
+        <w:rPr>
+          <w:b/>
+        </w:rPr>
+        <w:t xml:space="preserve">6. </w:t>
+      </w:r>
+      <w:r>
+        <w:t xml:space="preserve">Back in WapHub → Meta Ads Launcher: launch, or press Resume on a paused campaign. If money runs out or a payment is due, WapHub shows a yellow banner and Resume explains what to fix.</w:t>
+      </w:r>
+    </w:p>
+    <w:p>
+      <w:pPr>
+        <w:pStyle w:val="Heading2"/>
+      </w:pPr>
+      <w:r>
+        <w:t>4.5 Reconnect when</w:t>
       </w:r>
     </w:p>
     <w:p>

</xml_diff>